<commit_message>
Newsletter: page frame, section separators, example images, investigations-by-plant chart
Co-Authored-By: Claude Opus 5.5 <noreply@anthropic.com>
Claude-Session: https://claude.ai/code/session_01H4VRxzcpqxQkeA2hoJ4EUi
</commit_message>
<xml_diff>
--- a/newsletter/quality_newsletter_design.docx
+++ b/newsletter/quality_newsletter_design.docx
@@ -10,7 +10,7 @@
       <w:r>
         <w:drawing>
           <wp:inline distT="0" distB="0" distL="0" distR="0">
-            <wp:extent cx="6667500" cy="1171575"/>
+            <wp:extent cx="6591300" cy="1152525"/>
             <wp:effectExtent t="0" r="0" b="0" l="0"/>
             <wp:docPr id="1" name="banner" descr="באנר לוגו התעשייה האווירית" title="IAI"/>
             <wp:cNvGraphicFramePr>
@@ -35,7 +35,7 @@
                   <pic:spPr bwMode="auto">
                     <a:xfrm>
                       <a:off x="0" y="0"/>
-                      <a:ext cx="6667500" cy="1171575"/>
+                      <a:ext cx="6591300" cy="1152525"/>
                     </a:xfrm>
                     <a:prstGeom prst="rect">
                       <a:avLst/>
@@ -51,7 +51,7 @@
     <w:tbl>
       <w:tblPr>
         <w:bidiVisual/>
-        <w:tblW w:type="dxa" w:w="10506"/>
+        <w:tblW w:type="dxa" w:w="10386"/>
         <w:tblBorders>
           <w:top w:val="none" w:color="auto" w:sz="0"/>
           <w:left w:val="none" w:color="auto" w:sz="0"/>
@@ -63,14 +63,14 @@
         <w:tblLayout w:type="fixed"/>
       </w:tblPr>
       <w:tblGrid>
-        <w:gridCol w:w="6306"/>
+        <w:gridCol w:w="6186"/>
         <w:gridCol w:w="300"/>
         <w:gridCol w:w="3900"/>
       </w:tblGrid>
       <w:tr>
         <w:tc>
           <w:tcPr>
-            <w:tcW w:type="dxa" w:w="6306"/>
+            <w:tcW w:type="dxa" w:w="6186"/>
             <w:tcBorders>
               <w:top w:val="none" w:color="auto" w:sz="0"/>
               <w:left w:val="none" w:color="auto" w:sz="0"/>
@@ -205,24 +205,7 @@
           <w:bottom w:val="single" w:color="3D4349" w:sz="12" w:space="1"/>
         </w:pBdr>
         <w:bidi/>
-        <w:spacing w:after="100" w:before="0" w:line="264"/>
-        <w:jc w:val="right"/>
-      </w:pPr>
-      <w:r>
-        <w:rPr>
-          <w:rFonts w:ascii="Arial" w:cs="Arial" w:eastAsia="Arial" w:hAnsi="Arial"/>
-          <w:color w:val="3D4349"/>
-          <w:sz w:val="4"/>
-          <w:szCs w:val="4"/>
-          <w:rtl/>
-        </w:rPr>
-        <w:t xml:space="preserve"/>
-      </w:r>
-    </w:p>
-    <w:p>
-      <w:pPr>
-        <w:bidi/>
-        <w:spacing w:after="0" w:before="0" w:line="40"/>
+        <w:spacing w:after="120" w:before="0" w:line="120"/>
         <w:jc w:val="right"/>
       </w:pPr>
       <w:r>
@@ -239,7 +222,7 @@
     <w:tbl>
       <w:tblPr>
         <w:bidiVisual/>
-        <w:tblW w:type="dxa" w:w="10506"/>
+        <w:tblW w:type="dxa" w:w="10386"/>
         <w:tblBorders>
           <w:top w:val="none" w:color="auto" w:sz="0"/>
           <w:left w:val="none" w:color="auto" w:sz="0"/>
@@ -251,14 +234,14 @@
         <w:tblLayout w:type="fixed"/>
       </w:tblPr>
       <w:tblGrid>
-        <w:gridCol w:w="6106"/>
+        <w:gridCol w:w="5986"/>
         <w:gridCol w:w="250"/>
         <w:gridCol w:w="4150"/>
       </w:tblGrid>
       <w:tr>
         <w:tc>
           <w:tcPr>
-            <w:tcW w:type="dxa" w:w="6106"/>
+            <w:tcW w:type="dxa" w:w="5986"/>
             <w:tcBorders>
               <w:top w:val="none" w:color="auto" w:sz="0"/>
               <w:left w:val="none" w:color="auto" w:sz="0"/>
@@ -314,7 +297,7 @@
                 <w:szCs w:val="20"/>
                 <w:rtl/>
               </w:rPr>
-              <w:t xml:space="preserve">[מפעל א'] – </w:t>
+              <w:t xml:space="preserve">[משגב] – </w:t>
             </w:r>
             <w:r>
               <w:rPr>
@@ -348,7 +331,7 @@
                 <w:szCs w:val="20"/>
                 <w:rtl/>
               </w:rPr>
-              <w:t xml:space="preserve">[מפעל ב'] – </w:t>
+              <w:t xml:space="preserve">[יבשה] – </w:t>
             </w:r>
             <w:r>
               <w:rPr>
@@ -382,7 +365,7 @@
                 <w:szCs w:val="20"/>
                 <w:rtl/>
               </w:rPr>
-              <w:t xml:space="preserve">[מפעל ג'] – </w:t>
+              <w:t xml:space="preserve">[מוטסות] – </w:t>
             </w:r>
             <w:r>
               <w:rPr>
@@ -426,7 +409,7 @@
                 <w:szCs w:val="20"/>
                 <w:rtl/>
               </w:rPr>
-              <w:t xml:space="preserve">3 מתוך 6 הממצאים המשניים עסקו בניהול תצורה ושינויים הנדסיים. מומלץ סיקור פנימי ממוקד בכל המפעלים.</w:t>
+              <w:t xml:space="preserve">3 מתוך 6 הממצאים המשניים עסקו בניהול תצורה. מומלץ סיקור פנימי ממוקד בכל המפעלים.</w:t>
             </w:r>
           </w:p>
           <w:p>
@@ -460,7 +443,7 @@
                 <w:szCs w:val="20"/>
                 <w:rtl/>
               </w:rPr>
-              <w:t xml:space="preserve">סיקור הסמכה מחדש ב[מפעל א'] בחודש [נובמבר], וסיקור המשך של הלקוח ב[מפעל ב'].</w:t>
+              <w:t xml:space="preserve">סיקור הסמכה מחדש ב[תקשוב ול"א] בחודש [נובמבר], וסיקור המשך של הלקוח ב[יבשה].</w:t>
             </w:r>
           </w:p>
         </w:tc>
@@ -524,7 +507,7 @@
             <w:r>
               <w:drawing>
                 <wp:inline distT="0" distB="0" distL="0" distR="0">
-                  <wp:extent cx="2476500" cy="2609850"/>
+                  <wp:extent cx="2238375" cy="2238375"/>
                   <wp:effectExtent t="0" r="0" b="0" l="0"/>
                   <wp:docPr id="1" name="img_audit.png" descr="לחיצה ימנית &gt; שינוי תמונה כדי להחליף" title="תמונה"/>
                   <wp:cNvGraphicFramePr>
@@ -549,7 +532,7 @@
                         <pic:spPr bwMode="auto">
                           <a:xfrm>
                             <a:off x="0" y="0"/>
-                            <a:ext cx="2476500" cy="2609850"/>
+                            <a:ext cx="2238375" cy="2238375"/>
                           </a:xfrm>
                           <a:prstGeom prst="rect">
                             <a:avLst/>
@@ -567,8 +550,11 @@
     </w:tbl>
     <w:p>
       <w:pPr>
+        <w:pBdr>
+          <w:bottom w:val="single" w:color="9DB9D8" w:sz="8" w:space="1"/>
+        </w:pBdr>
         <w:bidi/>
-        <w:spacing w:after="0" w:before="0" w:line="160"/>
+        <w:spacing w:after="120" w:before="0" w:line="120"/>
         <w:jc w:val="right"/>
       </w:pPr>
       <w:r>
@@ -585,7 +571,7 @@
     <w:tbl>
       <w:tblPr>
         <w:bidiVisual/>
-        <w:tblW w:type="dxa" w:w="10506"/>
+        <w:tblW w:type="dxa" w:w="10386"/>
         <w:tblBorders>
           <w:top w:val="none" w:color="auto" w:sz="0"/>
           <w:left w:val="none" w:color="auto" w:sz="0"/>
@@ -597,12 +583,13 @@
         <w:tblLayout w:type="fixed"/>
       </w:tblPr>
       <w:tblGrid>
-        <w:gridCol w:w="10506"/>
+        <w:gridCol w:w="7586"/>
+        <w:gridCol w:w="2800"/>
       </w:tblGrid>
       <w:tr>
         <w:tc>
           <w:tcPr>
-            <w:tcW w:type="dxa" w:w="10506"/>
+            <w:tcW w:type="dxa" w:w="7586"/>
             <w:tcBorders>
               <w:top w:val="none" w:color="auto" w:sz="0"/>
               <w:left w:val="none" w:color="auto" w:sz="0"/>
@@ -611,9 +598,9 @@
             </w:tcBorders>
             <w:shd w:fill="2F6497" w:color="auto" w:val="clear"/>
             <w:tcMar>
-              <w:top w:type="dxa" w:w="160"/>
-              <w:left w:type="dxa" w:w="260"/>
-              <w:bottom w:type="dxa" w:w="160"/>
+              <w:top w:type="dxa" w:w="140"/>
+              <w:left w:type="dxa" w:w="160"/>
+              <w:bottom w:type="dxa" w:w="140"/>
               <w:right w:type="dxa" w:w="300"/>
             </w:tcMar>
             <w:vAlign w:val="center"/>
@@ -647,11 +634,11 @@
               <w:rPr>
                 <w:rFonts w:ascii="Arial" w:cs="Arial" w:eastAsia="Arial" w:hAnsi="Arial"/>
                 <w:color w:val="FFFFFF"/>
-                <w:sz w:val="19"/>
-                <w:szCs w:val="19"/>
-                <w:rtl/>
-              </w:rPr>
-              <w:t xml:space="preserve">ב-30 בספטמבר 2026 הוסטה טיסת FZ1073 מדובאי לתל אביב (בואינג 737 MAX, 174 נוסעים) לנחיתת חירום בתבוך שבסעודיה, אחרי תקיפה בתא הטייס. לפי הממצאים הראשוניים של הרשויות בסעודיה, טייס המשנה תקף את הקברניט, ושניהם נפצעו. אנשי צוות של flydubai שטסו כנוסעים השתלטו על המטוס והנחיתו אותו בשלום. החקירה עדיין נמשכת.</w:t>
+                <w:sz w:val="18"/>
+                <w:szCs w:val="18"/>
+                <w:rtl/>
+              </w:rPr>
+              <w:t xml:space="preserve">ב-30 בספטמבר 2026 הוסטה טיסת FZ1073 מדובאי לתל אביב (174 נוסעים) לנחיתת חירום בתבוך שבסעודיה, אחרי תקיפה בתא הטייס. לפי ממצאים ראשוניים, טייס המשנה תקף את הקברניט. אנשי צוות שטסו כנוסעים השתלטו על המטוס והנחיתו אותו בשלום. החקירה נמשכת.</w:t>
             </w:r>
           </w:p>
           <w:p>
@@ -700,11 +687,11 @@
               <w:rPr>
                 <w:rFonts w:ascii="Arial" w:cs="Arial" w:eastAsia="Arial" w:hAnsi="Arial"/>
                 <w:color w:val="FFFFFF"/>
-                <w:sz w:val="19"/>
-                <w:szCs w:val="19"/>
-                <w:rtl/>
-              </w:rPr>
-              <w:t xml:space="preserve">דלת תא הטייס המשוריינת נועדה לעצור איום מבחוץ, ולפי הדיווחים הקשתה על הכניסה כשהאיום היה מבפנים. כל בקרה שאנחנו מוסיפים צריך לבחון גם לפי האופן שבו היא עלולה להיכשל.</w:t>
+                <w:sz w:val="18"/>
+                <w:szCs w:val="18"/>
+                <w:rtl/>
+              </w:rPr>
+              <w:t xml:space="preserve">הדלת המשוריינת נועדה לעצור איום מבחוץ, ולפי הדיווחים הקשתה על הכניסה כשהאיום היה מבפנים. כל בקרה צריך לבחון גם לפי האופן שבו היא עלולה להיכשל.</w:t>
             </w:r>
           </w:p>
           <w:p>
@@ -734,11 +721,11 @@
               <w:rPr>
                 <w:rFonts w:ascii="Arial" w:cs="Arial" w:eastAsia="Arial" w:hAnsi="Arial"/>
                 <w:color w:val="FFFFFF"/>
-                <w:sz w:val="19"/>
-                <w:szCs w:val="19"/>
-                <w:rtl/>
-              </w:rPr>
-              <w:t xml:space="preserve">הנחיתה הבטוחה התאפשרה בזכות אנשי צוות מיומנים שהיו במקום ופעלו מהר.</w:t>
+                <w:sz w:val="18"/>
+                <w:szCs w:val="18"/>
+                <w:rtl/>
+              </w:rPr>
+              <w:t xml:space="preserve">אנשי צוות מיומנים שהיו במקום ופעלו מהר אפשרו נחיתה בטוחה.</w:t>
             </w:r>
           </w:p>
           <w:p>
@@ -768,241 +755,28 @@
               <w:rPr>
                 <w:rFonts w:ascii="Arial" w:cs="Arial" w:eastAsia="Arial" w:hAnsi="Arial"/>
                 <w:color w:val="FFFFFF"/>
-                <w:sz w:val="19"/>
-                <w:szCs w:val="19"/>
-                <w:rtl/>
-              </w:rPr>
-              <w:t xml:space="preserve">בימים הראשונים פורסמו גרסאות סותרות. תחקיר טוב לא קובע מסקנה לפני שהעובדות מבוססות.</w:t>
+                <w:sz w:val="18"/>
+                <w:szCs w:val="18"/>
+                <w:rtl/>
+              </w:rPr>
+              <w:t xml:space="preserve">בימים הראשונים פורסמו גרסאות סותרות. לא קובעים מסקנה לפני שהעובדות מבוססות.</w:t>
             </w:r>
           </w:p>
         </w:tc>
-      </w:tr>
-    </w:tbl>
-    <w:p>
-      <w:pPr>
-        <w:bidi/>
-        <w:spacing w:after="0" w:before="0" w:line="160"/>
-        <w:jc w:val="right"/>
-      </w:pPr>
-      <w:r>
-        <w:rPr>
-          <w:rFonts w:ascii="Arial" w:cs="Arial" w:eastAsia="Arial" w:hAnsi="Arial"/>
-          <w:color w:val="3D4349"/>
-          <w:sz w:val="4"/>
-          <w:szCs w:val="4"/>
-          <w:rtl/>
-        </w:rPr>
-        <w:t xml:space="preserve"/>
-      </w:r>
-    </w:p>
-    <w:tbl>
-      <w:tblPr>
-        <w:bidiVisual/>
-        <w:tblW w:type="dxa" w:w="10506"/>
-        <w:tblBorders>
-          <w:top w:val="none" w:color="auto" w:sz="0"/>
-          <w:left w:val="none" w:color="auto" w:sz="0"/>
-          <w:bottom w:val="none" w:color="auto" w:sz="0"/>
-          <w:right w:val="none" w:color="auto" w:sz="0"/>
-          <w:insideH w:val="none" w:color="auto" w:sz="0"/>
-          <w:insideV w:val="none" w:color="auto" w:sz="0"/>
-        </w:tblBorders>
-        <w:tblLayout w:type="fixed"/>
-      </w:tblPr>
-      <w:tblGrid>
-        <w:gridCol w:w="6000"/>
-        <w:gridCol w:w="250"/>
-        <w:gridCol w:w="4256"/>
-      </w:tblGrid>
-      <w:tr>
         <w:tc>
           <w:tcPr>
-            <w:tcW w:type="dxa" w:w="6000"/>
+            <w:tcW w:type="dxa" w:w="2800"/>
             <w:tcBorders>
               <w:top w:val="none" w:color="auto" w:sz="0"/>
               <w:left w:val="none" w:color="auto" w:sz="0"/>
               <w:bottom w:val="none" w:color="auto" w:sz="0"/>
               <w:right w:val="none" w:color="auto" w:sz="0"/>
             </w:tcBorders>
+            <w:shd w:fill="2F6497" w:color="auto" w:val="clear"/>
             <w:tcMar>
-              <w:top w:type="dxa" w:w="0"/>
-              <w:left w:type="dxa" w:w="0"/>
-              <w:bottom w:type="dxa" w:w="0"/>
-              <w:right w:type="dxa" w:w="0"/>
-            </w:tcMar>
-            <w:vAlign w:val="top"/>
-          </w:tcPr>
-          <w:p>
-            <w:pPr>
-              <w:bidi/>
-              <w:spacing w:after="120" w:before="0" w:line="240"/>
-              <w:jc w:val="right"/>
-            </w:pPr>
-            <w:r>
-              <w:rPr>
-                <w:rFonts w:ascii="Arial" w:cs="Arial" w:eastAsia="Arial" w:hAnsi="Arial"/>
-                <w:b/>
-                <w:bCs/>
-                <w:color w:val="3D4349"/>
-                <w:sz w:val="30"/>
-                <w:szCs w:val="30"/>
-                <w:rtl/>
-              </w:rPr>
-              <w:t xml:space="preserve">עמידה במדדים – תחקירים ותובנות</w:t>
-            </w:r>
-          </w:p>
-          <w:p>
-            <w:pPr>
-              <w:pStyle w:val="ListParagraph"/>
-              <w:numPr>
-                <w:ilvl w:val="0"/>
-                <w:numId w:val="3"/>
-              </w:numPr>
-              <w:bidi/>
-              <w:spacing w:after="60" w:before="0" w:line="264"/>
-              <w:jc w:val="right"/>
-            </w:pPr>
-            <w:r>
-              <w:rPr>
-                <w:rFonts w:ascii="Arial" w:cs="Arial" w:eastAsia="Arial" w:hAnsi="Arial"/>
-                <w:b/>
-                <w:bCs/>
-                <w:color w:val="595959"/>
-                <w:sz w:val="19"/>
-                <w:szCs w:val="19"/>
-                <w:rtl/>
-              </w:rPr>
-              <w:t xml:space="preserve">עלות אי-איכות: ירדה ל-1.8% מהמחזור, אך עדיין מעל היעד (1.5%). עיקר העלות: עבודה חוזרת ב[מפעל ג'].</w:t>
-            </w:r>
-          </w:p>
-          <w:p>
-            <w:pPr>
-              <w:pStyle w:val="ListParagraph"/>
-              <w:numPr>
-                <w:ilvl w:val="0"/>
-                <w:numId w:val="3"/>
-              </w:numPr>
-              <w:bidi/>
-              <w:spacing w:after="60" w:before="0" w:line="264"/>
-              <w:jc w:val="right"/>
-            </w:pPr>
-            <w:r>
-              <w:rPr>
-                <w:rFonts w:ascii="Arial" w:cs="Arial" w:eastAsia="Arial" w:hAnsi="Arial"/>
-                <w:b/>
-                <w:bCs/>
-                <w:color w:val="595959"/>
-                <w:sz w:val="19"/>
-                <w:szCs w:val="19"/>
-                <w:rtl/>
-              </w:rPr>
-              <w:t xml:space="preserve">פעולות מתקנות: 84% נסגרו בזמן (יעד 90%), ו-12 פעולות בפיגור של יותר מ-60 יום.</w:t>
-            </w:r>
-          </w:p>
-          <w:p>
-            <w:pPr>
-              <w:pStyle w:val="ListParagraph"/>
-              <w:numPr>
-                <w:ilvl w:val="0"/>
-                <w:numId w:val="3"/>
-              </w:numPr>
-              <w:bidi/>
-              <w:spacing w:after="120" w:before="0" w:line="264"/>
-              <w:jc w:val="right"/>
-            </w:pPr>
-            <w:r>
-              <w:rPr>
-                <w:rFonts w:ascii="Arial" w:cs="Arial" w:eastAsia="Arial" w:hAnsi="Arial"/>
-                <w:b/>
-                <w:bCs/>
-                <w:color w:val="595959"/>
-                <w:sz w:val="19"/>
-                <w:szCs w:val="19"/>
-                <w:rtl/>
-              </w:rPr>
-              <w:t xml:space="preserve">תקלות שהגיעו ללקוח: אחת בלבד (יעד: עד 2), שיפור לעומת הרבעון הקודם.</w:t>
-            </w:r>
-          </w:p>
-          <w:p>
-            <w:pPr>
-              <w:bidi/>
-              <w:spacing w:after="0" w:before="0" w:line="264"/>
-              <w:jc w:val="right"/>
-            </w:pPr>
-            <w:r>
-              <w:rPr>
-                <w:rFonts w:ascii="Arial" w:cs="Arial" w:eastAsia="Arial" w:hAnsi="Arial"/>
-                <w:b/>
-                <w:bCs/>
-                <w:color w:val="2F6497"/>
-                <w:sz w:val="19"/>
-                <w:szCs w:val="19"/>
-                <w:rtl/>
-              </w:rPr>
-              <w:t xml:space="preserve">מקרה הרבעון: </w:t>
-            </w:r>
-            <w:r>
-              <w:rPr>
-                <w:rFonts w:ascii="Arial" w:cs="Arial" w:eastAsia="Arial" w:hAnsi="Arial"/>
-                <w:b/>
-                <w:bCs/>
-                <w:color w:val="595959"/>
-                <w:sz w:val="19"/>
-                <w:szCs w:val="19"/>
-                <w:rtl/>
-              </w:rPr>
-              <w:t xml:space="preserve">כרטיס נשלח ללקוח עם רכיב בגרסה לא מאושרת. שורש הבעיה: תהליך שינוי הנדסי בלי הסגר של מלאי קיים. מה שינינו: הסגר אוטומטי במערכת ה-ERP. בדקו אם זה קיים גם אצלכם.</w:t>
-            </w:r>
-          </w:p>
-        </w:tc>
-        <w:tc>
-          <w:tcPr>
-            <w:tcW w:type="dxa" w:w="250"/>
-            <w:tcBorders>
-              <w:top w:val="none" w:color="auto" w:sz="0"/>
-              <w:left w:val="none" w:color="auto" w:sz="0"/>
-              <w:bottom w:val="none" w:color="auto" w:sz="0"/>
-              <w:right w:val="none" w:color="auto" w:sz="0"/>
-            </w:tcBorders>
-            <w:tcMar>
-              <w:top w:type="dxa" w:w="0"/>
-              <w:left w:type="dxa" w:w="0"/>
-              <w:bottom w:type="dxa" w:w="0"/>
-              <w:right w:type="dxa" w:w="0"/>
-            </w:tcMar>
-            <w:vAlign w:val="top"/>
-          </w:tcPr>
-          <w:p>
-            <w:pPr>
-              <w:bidi/>
-              <w:spacing w:after="80" w:before="0" w:line="264"/>
-              <w:jc w:val="right"/>
-            </w:pPr>
-            <w:r>
-              <w:rPr>
-                <w:rFonts w:ascii="Arial" w:cs="Arial" w:eastAsia="Arial" w:hAnsi="Arial"/>
-                <w:color w:val="3D4349"/>
-                <w:sz w:val="19"/>
-                <w:szCs w:val="19"/>
-                <w:rtl/>
-              </w:rPr>
-              <w:t xml:space="preserve"/>
-            </w:r>
-          </w:p>
-        </w:tc>
-        <w:tc>
-          <w:tcPr>
-            <w:tcW w:type="dxa" w:w="4256"/>
-            <w:tcBorders>
-              <w:top w:val="none" w:color="auto" w:sz="0"/>
-              <w:left w:val="none" w:color="auto" w:sz="0"/>
-              <w:bottom w:val="none" w:color="auto" w:sz="0"/>
-              <w:right w:val="none" w:color="auto" w:sz="0"/>
-            </w:tcBorders>
-            <w:tcMar>
-              <w:top w:type="dxa" w:w="0"/>
-              <w:left w:type="dxa" w:w="0"/>
-              <w:bottom w:type="dxa" w:w="0"/>
+              <w:top w:type="dxa" w:w="100"/>
+              <w:left w:type="dxa" w:w="150"/>
+              <w:bottom w:type="dxa" w:w="100"/>
               <w:right w:type="dxa" w:w="0"/>
             </w:tcMar>
             <w:vAlign w:val="center"/>
@@ -1015,9 +789,9 @@
             <w:r>
               <w:drawing>
                 <wp:inline distT="0" distB="0" distL="0" distR="0">
-                  <wp:extent cx="2476500" cy="2095500"/>
+                  <wp:extent cx="1666875" cy="1152525"/>
                   <wp:effectExtent t="0" r="0" b="0" l="0"/>
-                  <wp:docPr id="1" name="img_kpi.png" descr="לחיצה ימנית &gt; שינוי תמונה כדי להחליף" title="תמונה"/>
+                  <wp:docPr id="1" name="img_flight.png" descr="לחיצה ימנית &gt; שינוי תמונה כדי להחליף" title="תמונה"/>
                   <wp:cNvGraphicFramePr>
                     <a:graphicFrameLocks xmlns:a="http://schemas.openxmlformats.org/drawingml/2006/main" noChangeAspect="1"/>
                   </wp:cNvGraphicFramePr>
@@ -1040,7 +814,7 @@
                         <pic:spPr bwMode="auto">
                           <a:xfrm>
                             <a:off x="0" y="0"/>
-                            <a:ext cx="2476500" cy="2095500"/>
+                            <a:ext cx="1666875" cy="1152525"/>
                           </a:xfrm>
                           <a:prstGeom prst="rect">
                             <a:avLst/>
@@ -1053,33 +827,314 @@
               </w:drawing>
             </w:r>
           </w:p>
-          <w:p>
-            <w:pPr>
-              <w:bidi/>
-              <w:spacing w:after="0" w:before="60" w:line="264"/>
-              <w:jc w:val="center"/>
-            </w:pPr>
-            <w:r>
-              <w:rPr>
-                <w:rFonts w:ascii="Arial" w:cs="Arial" w:eastAsia="Arial" w:hAnsi="Arial"/>
-                <w:color w:val="595959"/>
-                <w:sz w:val="16"/>
-                <w:szCs w:val="16"/>
-                <w:rtl/>
-              </w:rPr>
-              <w:t xml:space="preserve">עלות אי-איכות (COPQ) לפי רבעון, באחוזים מהמחזור. הקו המקווקו: יעד 1.5%</w:t>
-            </w:r>
-          </w:p>
         </w:tc>
       </w:tr>
     </w:tbl>
     <w:p>
       <w:pPr>
         <w:pBdr>
+          <w:bottom w:val="single" w:color="9DB9D8" w:sz="8" w:space="1"/>
+        </w:pBdr>
+        <w:bidi/>
+        <w:spacing w:after="120" w:before="0" w:line="120"/>
+        <w:jc w:val="right"/>
+      </w:pPr>
+      <w:r>
+        <w:rPr>
+          <w:rFonts w:ascii="Arial" w:cs="Arial" w:eastAsia="Arial" w:hAnsi="Arial"/>
+          <w:color w:val="3D4349"/>
+          <w:sz w:val="4"/>
+          <w:szCs w:val="4"/>
+          <w:rtl/>
+        </w:rPr>
+        <w:t xml:space="preserve"/>
+      </w:r>
+    </w:p>
+    <w:tbl>
+      <w:tblPr>
+        <w:bidiVisual/>
+        <w:tblW w:type="dxa" w:w="10386"/>
+        <w:tblBorders>
+          <w:top w:val="none" w:color="auto" w:sz="0"/>
+          <w:left w:val="none" w:color="auto" w:sz="0"/>
+          <w:bottom w:val="none" w:color="auto" w:sz="0"/>
+          <w:right w:val="none" w:color="auto" w:sz="0"/>
+          <w:insideH w:val="none" w:color="auto" w:sz="0"/>
+          <w:insideV w:val="none" w:color="auto" w:sz="0"/>
+        </w:tblBorders>
+        <w:tblLayout w:type="fixed"/>
+      </w:tblPr>
+      <w:tblGrid>
+        <w:gridCol w:w="5880"/>
+        <w:gridCol w:w="250"/>
+        <w:gridCol w:w="4256"/>
+      </w:tblGrid>
+      <w:tr>
+        <w:tc>
+          <w:tcPr>
+            <w:tcW w:type="dxa" w:w="5880"/>
+            <w:tcBorders>
+              <w:top w:val="none" w:color="auto" w:sz="0"/>
+              <w:left w:val="none" w:color="auto" w:sz="0"/>
+              <w:bottom w:val="none" w:color="auto" w:sz="0"/>
+              <w:right w:val="none" w:color="auto" w:sz="0"/>
+            </w:tcBorders>
+            <w:tcMar>
+              <w:top w:type="dxa" w:w="0"/>
+              <w:left w:type="dxa" w:w="0"/>
+              <w:bottom w:type="dxa" w:w="0"/>
+              <w:right w:type="dxa" w:w="0"/>
+            </w:tcMar>
+            <w:vAlign w:val="top"/>
+          </w:tcPr>
+          <w:p>
+            <w:pPr>
+              <w:bidi/>
+              <w:spacing w:after="120" w:before="0" w:line="240"/>
+              <w:jc w:val="right"/>
+            </w:pPr>
+            <w:r>
+              <w:rPr>
+                <w:rFonts w:ascii="Arial" w:cs="Arial" w:eastAsia="Arial" w:hAnsi="Arial"/>
+                <w:b/>
+                <w:bCs/>
+                <w:color w:val="3D4349"/>
+                <w:sz w:val="30"/>
+                <w:szCs w:val="30"/>
+                <w:rtl/>
+              </w:rPr>
+              <w:t xml:space="preserve">עמידה במדדים – תחקירים ותובנות</w:t>
+            </w:r>
+          </w:p>
+          <w:p>
+            <w:pPr>
+              <w:pStyle w:val="ListParagraph"/>
+              <w:numPr>
+                <w:ilvl w:val="0"/>
+                <w:numId w:val="3"/>
+              </w:numPr>
+              <w:bidi/>
+              <w:spacing w:after="60" w:before="0" w:line="264"/>
+              <w:jc w:val="right"/>
+            </w:pPr>
+            <w:r>
+              <w:rPr>
+                <w:rFonts w:ascii="Arial" w:cs="Arial" w:eastAsia="Arial" w:hAnsi="Arial"/>
+                <w:b/>
+                <w:bCs/>
+                <w:color w:val="595959"/>
+                <w:sz w:val="19"/>
+                <w:szCs w:val="19"/>
+                <w:rtl/>
+              </w:rPr>
+              <w:t xml:space="preserve">תחקירים ברבעון: 42, מהם 32 נסגרו (76%). הריכוז הגבוה ביבשה ובמוטסות.</w:t>
+            </w:r>
+          </w:p>
+          <w:p>
+            <w:pPr>
+              <w:pStyle w:val="ListParagraph"/>
+              <w:numPr>
+                <w:ilvl w:val="0"/>
+                <w:numId w:val="3"/>
+              </w:numPr>
+              <w:bidi/>
+              <w:spacing w:after="60" w:before="0" w:line="264"/>
+              <w:jc w:val="right"/>
+            </w:pPr>
+            <w:r>
+              <w:rPr>
+                <w:rFonts w:ascii="Arial" w:cs="Arial" w:eastAsia="Arial" w:hAnsi="Arial"/>
+                <w:b/>
+                <w:bCs/>
+                <w:color w:val="595959"/>
+                <w:sz w:val="19"/>
+                <w:szCs w:val="19"/>
+                <w:rtl/>
+              </w:rPr>
+              <w:t xml:space="preserve">עלות אי-איכות: 1.8% מהמחזור, עדיין מעל היעד (1.5%). עיקר העלות: עבודה חוזרת.</w:t>
+            </w:r>
+          </w:p>
+          <w:p>
+            <w:pPr>
+              <w:pStyle w:val="ListParagraph"/>
+              <w:numPr>
+                <w:ilvl w:val="0"/>
+                <w:numId w:val="3"/>
+              </w:numPr>
+              <w:bidi/>
+              <w:spacing w:after="120" w:before="0" w:line="264"/>
+              <w:jc w:val="right"/>
+            </w:pPr>
+            <w:r>
+              <w:rPr>
+                <w:rFonts w:ascii="Arial" w:cs="Arial" w:eastAsia="Arial" w:hAnsi="Arial"/>
+                <w:b/>
+                <w:bCs/>
+                <w:color w:val="595959"/>
+                <w:sz w:val="19"/>
+                <w:szCs w:val="19"/>
+                <w:rtl/>
+              </w:rPr>
+              <w:t xml:space="preserve">פעולות מתקנות: 84% נסגרו בזמן (יעד 90%), ו-12 פעולות בפיגור של יותר מ-60 יום.</w:t>
+            </w:r>
+          </w:p>
+          <w:p>
+            <w:pPr>
+              <w:bidi/>
+              <w:spacing w:after="0" w:before="0" w:line="264"/>
+              <w:jc w:val="right"/>
+            </w:pPr>
+            <w:r>
+              <w:rPr>
+                <w:rFonts w:ascii="Arial" w:cs="Arial" w:eastAsia="Arial" w:hAnsi="Arial"/>
+                <w:b/>
+                <w:bCs/>
+                <w:color w:val="2F6497"/>
+                <w:sz w:val="19"/>
+                <w:szCs w:val="19"/>
+                <w:rtl/>
+              </w:rPr>
+              <w:t xml:space="preserve">מקרה הרבעון: </w:t>
+            </w:r>
+            <w:r>
+              <w:rPr>
+                <w:rFonts w:ascii="Arial" w:cs="Arial" w:eastAsia="Arial" w:hAnsi="Arial"/>
+                <w:b/>
+                <w:bCs/>
+                <w:color w:val="595959"/>
+                <w:sz w:val="19"/>
+                <w:szCs w:val="19"/>
+                <w:rtl/>
+              </w:rPr>
+              <w:t xml:space="preserve">כרטיס נשלח ללקוח עם רכיב בגרסה לא מאושרת. שורש הבעיה: תהליך שינוי הנדסי בלי הסגר של מלאי קיים. מה שינינו: הסגר אוטומטי במערכת ה-ERP. בדקו אם זה קיים גם אצלכם.</w:t>
+            </w:r>
+          </w:p>
+        </w:tc>
+        <w:tc>
+          <w:tcPr>
+            <w:tcW w:type="dxa" w:w="250"/>
+            <w:tcBorders>
+              <w:top w:val="none" w:color="auto" w:sz="0"/>
+              <w:left w:val="none" w:color="auto" w:sz="0"/>
+              <w:bottom w:val="none" w:color="auto" w:sz="0"/>
+              <w:right w:val="none" w:color="auto" w:sz="0"/>
+            </w:tcBorders>
+            <w:tcMar>
+              <w:top w:type="dxa" w:w="0"/>
+              <w:left w:type="dxa" w:w="0"/>
+              <w:bottom w:type="dxa" w:w="0"/>
+              <w:right w:type="dxa" w:w="0"/>
+            </w:tcMar>
+            <w:vAlign w:val="top"/>
+          </w:tcPr>
+          <w:p>
+            <w:pPr>
+              <w:bidi/>
+              <w:spacing w:after="80" w:before="0" w:line="264"/>
+              <w:jc w:val="right"/>
+            </w:pPr>
+            <w:r>
+              <w:rPr>
+                <w:rFonts w:ascii="Arial" w:cs="Arial" w:eastAsia="Arial" w:hAnsi="Arial"/>
+                <w:color w:val="3D4349"/>
+                <w:sz w:val="19"/>
+                <w:szCs w:val="19"/>
+                <w:rtl/>
+              </w:rPr>
+              <w:t xml:space="preserve"/>
+            </w:r>
+          </w:p>
+        </w:tc>
+        <w:tc>
+          <w:tcPr>
+            <w:tcW w:type="dxa" w:w="4256"/>
+            <w:tcBorders>
+              <w:top w:val="none" w:color="auto" w:sz="0"/>
+              <w:left w:val="none" w:color="auto" w:sz="0"/>
+              <w:bottom w:val="none" w:color="auto" w:sz="0"/>
+              <w:right w:val="none" w:color="auto" w:sz="0"/>
+            </w:tcBorders>
+            <w:tcMar>
+              <w:top w:type="dxa" w:w="0"/>
+              <w:left w:type="dxa" w:w="0"/>
+              <w:bottom w:type="dxa" w:w="0"/>
+              <w:right w:type="dxa" w:w="0"/>
+            </w:tcMar>
+            <w:vAlign w:val="center"/>
+          </w:tcPr>
+          <w:p>
+            <w:pPr>
+              <w:spacing w:after="0"/>
+              <w:jc w:val="center"/>
+            </w:pPr>
+            <w:r>
+              <w:drawing>
+                <wp:inline distT="0" distB="0" distL="0" distR="0">
+                  <wp:extent cx="2524125" cy="2028825"/>
+                  <wp:effectExtent t="0" r="0" b="0" l="0"/>
+                  <wp:docPr id="1" name="img_inv.png" descr="לחיצה ימנית &gt; שינוי תמונה כדי להחליף" title="תמונה"/>
+                  <wp:cNvGraphicFramePr>
+                    <a:graphicFrameLocks xmlns:a="http://schemas.openxmlformats.org/drawingml/2006/main" noChangeAspect="1"/>
+                  </wp:cNvGraphicFramePr>
+                  <a:graphic xmlns:a="http://schemas.openxmlformats.org/drawingml/2006/main">
+                    <a:graphicData uri="http://schemas.openxmlformats.org/drawingml/2006/picture">
+                      <pic:pic xmlns:pic="http://schemas.openxmlformats.org/drawingml/2006/picture">
+                        <pic:nvPicPr>
+                          <pic:cNvPr id="0" name="" descr=""/>
+                          <pic:cNvPicPr>
+                            <a:picLocks noChangeAspect="1" noChangeArrowheads="1"/>
+                          </pic:cNvPicPr>
+                        </pic:nvPicPr>
+                        <pic:blipFill>
+                          <a:blip r:embed="rId10" cstate="none"/>
+                          <a:srcRect/>
+                          <a:stretch>
+                            <a:fillRect/>
+                          </a:stretch>
+                        </pic:blipFill>
+                        <pic:spPr bwMode="auto">
+                          <a:xfrm>
+                            <a:off x="0" y="0"/>
+                            <a:ext cx="2524125" cy="2028825"/>
+                          </a:xfrm>
+                          <a:prstGeom prst="rect">
+                            <a:avLst/>
+                          </a:prstGeom>
+                        </pic:spPr>
+                      </pic:pic>
+                    </a:graphicData>
+                  </a:graphic>
+                </wp:inline>
+              </w:drawing>
+            </w:r>
+          </w:p>
+          <w:p>
+            <w:pPr>
+              <w:bidi/>
+              <w:spacing w:after="0" w:before="60" w:line="264"/>
+              <w:jc w:val="center"/>
+            </w:pPr>
+            <w:r>
+              <w:rPr>
+                <w:rFonts w:ascii="Arial" w:cs="Arial" w:eastAsia="Arial" w:hAnsi="Arial"/>
+                <w:color w:val="595959"/>
+                <w:sz w:val="16"/>
+                <w:szCs w:val="16"/>
+                <w:rtl/>
+              </w:rPr>
+              <w:t xml:space="preserve">כמות תחקירים ברבעון לפי מפעל: נסגרו מול פתוחים</w:t>
+            </w:r>
+          </w:p>
+        </w:tc>
+      </w:tr>
+    </w:tbl>
+    <w:p>
+      <w:pPr>
+        <w:pBdr>
           <w:top w:val="single" w:color="BFBFBF" w:sz="4" w:space="4"/>
         </w:pBdr>
         <w:bidi/>
-        <w:spacing w:after="0" w:before="200" w:line="264"/>
+        <w:spacing w:after="0" w:before="120" w:line="264"/>
         <w:jc w:val="center"/>
       </w:pPr>
       <w:r>
@@ -1095,7 +1150,13 @@
     </w:p>
     <w:sectPr>
       <w:pgSz w:w="11906" w:h="16838" w:orient="portrait"/>
-      <w:pgMar w:top="500" w:right="700" w:bottom="450" w:left="700" w:header="708" w:footer="708" w:gutter="0"/>
+      <w:pgMar w:top="560" w:right="760" w:bottom="450" w:left="760" w:header="708" w:footer="708" w:gutter="0"/>
+      <w:pgBorders w:display="allPages" w:offsetFrom="page">
+        <w:top w:val="single" w:color="2F6497" w:sz="18" w:space="18"/>
+        <w:left w:val="single" w:color="2F6497" w:sz="18" w:space="18"/>
+        <w:bottom w:val="single" w:color="2F6497" w:sz="18" w:space="18"/>
+        <w:right w:val="single" w:color="2F6497" w:sz="18" w:space="18"/>
+      </w:pgBorders>
       <w:pgNumType/>
       <w:docGrid w:linePitch="360"/>
     </w:sectPr>

</xml_diff>